<commit_message>
Refine independent projects in Premier R6647 resume
</commit_message>
<xml_diff>
--- a/output/cv-alanis-sun-premier-research-site-start-up-associate-i-r6647-2026-09-29.docx
+++ b/output/cv-alanis-sun-premier-research-site-start-up-associate-i-r6647-2026-09-29.docx
@@ -15,7 +15,159 @@
         <w:pStyle w:val="Normal"/>
       </w:pPr>
       <w:r>
-        <w:t xml:space="preserve">Cocoa, FL | 321-750-7281 | yushuangsun36@gmail.com | </w:t>
+        <w:t xml:space="preserve">Cocoa, FL | 321-750-7281 | yushuangsun36@gmail.com</w:t>
+      </w:r>
+      <w:r>
+        <w:br/>
+        <w:t>US Permanent Resident | Bilingual: English and Mandarin Chinese</w:t>
+      </w:r>
+    </w:p>
+    <w:p>
+      <w:pPr>
+        <w:pStyle w:val="Heading1"/>
+      </w:pPr>
+      <w:r>
+        <w:t>Professional Summary</w:t>
+      </w:r>
+    </w:p>
+    <w:p>
+      <w:pPr>
+        <w:pStyle w:val="Normal"/>
+      </w:pPr>
+      <w:r>
+        <w:t>Clinical-development professional with 6+ years supporting Phase I/II clinical trials in a GLP biotech environment, bringing clinical-sample traceability, source-document verification, quality-focused documentation, CRO coordination, and discrepancy resolution. Adds project planning, dependency and timeline tracking, status reporting, and cross-functional follow-through from laboratory operations while seeking to transition into formal clinical study start-up operations.</w:t>
+      </w:r>
+    </w:p>
+    <w:p>
+      <w:pPr>
+        <w:pStyle w:val="Heading1"/>
+      </w:pPr>
+      <w:r>
+        <w:t>Professional Experience</w:t>
+      </w:r>
+    </w:p>
+    <w:p>
+      <w:pPr>
+        <w:pStyle w:val="Heading2"/>
+      </w:pPr>
+      <w:r>
+        <w:t>Manager, Lab Operations</w:t>
+      </w:r>
+    </w:p>
+    <w:p>
+      <w:pPr>
+        <w:pStyle w:val="Normal"/>
+      </w:pPr>
+      <w:r>
+        <w:rPr>
+          <w:b/>
+        </w:rPr>
+        <w:t>Akesoe Biologics</w:t>
+      </w:r>
+      <w:r>
+        <w:t xml:space="preserve"> | Winter Springs, FL | May 2026-Present</w:t>
+      </w:r>
+    </w:p>
+    <w:p>
+      <w:pPr>
+        <w:pStyle w:val="ListBullet"/>
+      </w:pPr>
+      <w:r>
+        <w:t>Planned phased work for an early-stage project by breaking early phases into tasks, assigning responsibilities, identifying dependencies, and tracking status in ClickUp.</w:t>
+      </w:r>
+    </w:p>
+    <w:p>
+      <w:pPr>
+        <w:pStyle w:val="ListBullet"/>
+      </w:pPr>
+      <w:r>
+        <w:t>Prepared weekly status reports on completed work, potential impacts, next steps, and follow-ups; coordinated cross-functional inputs and resource needs.</w:t>
+      </w:r>
+    </w:p>
+    <w:p>
+      <w:pPr>
+        <w:pStyle w:val="ListBullet"/>
+      </w:pPr>
+      <w:r>
+        <w:t>Reviewed 30+ SOP/DCR records and electronic files, identified documentation/version inconsistencies, and supported document and form-completion improvements.</w:t>
+      </w:r>
+    </w:p>
+    <w:p>
+      <w:pPr>
+        <w:pStyle w:val="ListBullet"/>
+      </w:pPr>
+      <w:r>
+        <w:t>Documented a corrective response to an SOP-compliance issue through the established CAPA process and submitted it to QA for review; designed and conducted an internal mock-audit review, documenting findings and proposed actions for management review.</w:t>
+      </w:r>
+    </w:p>
+    <w:p>
+      <w:pPr>
+        <w:pStyle w:val="Heading2"/>
+      </w:pPr>
+      <w:r>
+        <w:t>Research Associate I</w:t>
+      </w:r>
+    </w:p>
+    <w:p>
+      <w:pPr>
+        <w:pStyle w:val="Normal"/>
+      </w:pPr>
+      <w:r>
+        <w:rPr>
+          <w:b/>
+        </w:rPr>
+        <w:t>Vaxxinity</w:t>
+      </w:r>
+      <w:r>
+        <w:t xml:space="preserve"> | Merritt Island, FL | Oct 2018-Jan 2025</w:t>
+      </w:r>
+    </w:p>
+    <w:p>
+      <w:pPr>
+        <w:pStyle w:val="ListBullet"/>
+      </w:pPr>
+      <w:r>
+        <w:t>Supported Phase I/II clinical bioanalytical work in a GLP environment, including assay optimization/validation, QC, sample testing, data analysis, and results/documentation transfer to CRO data teams.</w:t>
+      </w:r>
+    </w:p>
+    <w:p>
+      <w:pPr>
+        <w:pStyle w:val="ListBullet"/>
+      </w:pPr>
+      <w:r>
+        <w:t>Worked with 4,000+ clinical samples and temporarily supported a Phase I sample workflow through receipt/source-document and identity verification, CRO/internal ID traceability, Benchling records, exception investigation, and coordination with the sample manager.</w:t>
+      </w:r>
+    </w:p>
+    <w:p>
+      <w:pPr>
+        <w:pStyle w:val="ListBullet"/>
+      </w:pPr>
+      <w:r>
+        <w:t>Investigated a CRO data discrepancy by reviewing assay data and documentation, clarifying methodology, confirming visit-timing interpretation with internal clinical colleagues, and reviewing corrected CRO output.</w:t>
+      </w:r>
+    </w:p>
+    <w:p>
+      <w:pPr>
+        <w:pStyle w:val="ListBullet"/>
+      </w:pPr>
+      <w:r>
+        <w:t>Coordinated assigned technical/data issues across CRO data teams, internal clinical colleagues, sample-management personnel, and supervisors to support documentation accuracy and issue resolution.</w:t>
+      </w:r>
+    </w:p>
+    <w:p>
+      <w:pPr>
+        <w:pStyle w:val="Heading1"/>
+      </w:pPr>
+      <w:r>
+        <w:t>Independent Projects</w:t>
+      </w:r>
+    </w:p>
+    <w:p>
+      <w:pPr>
+        <w:pStyle w:val="Normal"/>
+      </w:pPr>
+      <w:r>
+        <w:t xml:space="preserve">Portfolio: </w:t>
       </w:r>
       <w:hyperlink r:id="rId3">
         <w:r>
@@ -23,166 +175,36 @@
             <w:color w:val="0563C1"/>
             <w:u w:val="single"/>
           </w:rPr>
-          <w:t>GitHub Portfolio</w:t>
+          <w:t>GitHub</w:t>
         </w:r>
       </w:hyperlink>
-      <w:r>
-        <w:br/>
-        <w:t>US Permanent Resident | Bilingual: English and Mandarin Chinese</w:t>
-      </w:r>
-    </w:p>
-    <w:p>
-      <w:pPr>
-        <w:pStyle w:val="Heading1"/>
-      </w:pPr>
-      <w:r>
-        <w:t>Professional Summary</w:t>
-      </w:r>
-    </w:p>
-    <w:p>
-      <w:pPr>
-        <w:pStyle w:val="Normal"/>
-      </w:pPr>
-      <w:r>
-        <w:t>Clinical-development professional with 6+ years supporting Phase I/II clinical trials in a GLP biotech environment, bringing clinical-sample traceability, source-document verification, quality-focused documentation, CRO coordination, and discrepancy resolution. Adds project planning, dependency and timeline tracking, status reporting, and cross-functional follow-through from laboratory operations while transitioning into formal clinical study start-up support.</w:t>
-      </w:r>
-    </w:p>
-    <w:p>
-      <w:pPr>
-        <w:pStyle w:val="Heading1"/>
-      </w:pPr>
-      <w:r>
-        <w:t>Professional Experience</w:t>
-      </w:r>
-    </w:p>
-    <w:p>
-      <w:pPr>
-        <w:pStyle w:val="Heading2"/>
-      </w:pPr>
-      <w:r>
-        <w:t>Manager, Lab Operations</w:t>
-      </w:r>
-    </w:p>
-    <w:p>
-      <w:pPr>
-        <w:pStyle w:val="Normal"/>
-      </w:pPr>
-      <w:r>
-        <w:rPr>
-          <w:b/>
-        </w:rPr>
-        <w:t>Akesoe Biologics</w:t>
-      </w:r>
-      <w:r>
-        <w:t xml:space="preserve"> | Winter Springs, FL | May 2026-Present</w:t>
-      </w:r>
-    </w:p>
-    <w:p>
-      <w:pPr>
-        <w:pStyle w:val="ListBullet"/>
-      </w:pPr>
-      <w:r>
-        <w:t>Planned phased work for an early-stage project by breaking early phases into tasks, assigning responsibilities, identifying dependencies, and tracking status in ClickUp.</w:t>
-      </w:r>
-    </w:p>
-    <w:p>
-      <w:pPr>
-        <w:pStyle w:val="ListBullet"/>
-      </w:pPr>
-      <w:r>
-        <w:t>Prepared weekly status reports on completed work, potential impacts, next steps, and follow-ups; coordinated cross-functional inputs and resource needs.</w:t>
-      </w:r>
-    </w:p>
-    <w:p>
-      <w:pPr>
-        <w:pStyle w:val="ListBullet"/>
-      </w:pPr>
-      <w:r>
-        <w:t>Reviewed 30+ SOP/DCR records and electronic files, identified documentation/version inconsistencies, and supported document and form-completion improvements.</w:t>
-      </w:r>
-    </w:p>
-    <w:p>
-      <w:pPr>
-        <w:pStyle w:val="ListBullet"/>
-      </w:pPr>
-      <w:r>
-        <w:t>Documented a corrective response to an SOP-compliance issue through the established CAPA process and submitted it to QA for review; designed and conducted an internal mock-audit review, documenting findings and proposed actions for management review.</w:t>
-      </w:r>
-    </w:p>
-    <w:p>
-      <w:pPr>
-        <w:pStyle w:val="Heading2"/>
-      </w:pPr>
-      <w:r>
-        <w:t>Research Associate I</w:t>
-      </w:r>
-    </w:p>
-    <w:p>
-      <w:pPr>
-        <w:pStyle w:val="Normal"/>
-      </w:pPr>
-      <w:r>
-        <w:rPr>
-          <w:b/>
-        </w:rPr>
-        <w:t>Vaxxinity</w:t>
-      </w:r>
-      <w:r>
-        <w:t xml:space="preserve"> | Merritt Island, FL | Oct 2018-Jan 2025</w:t>
-      </w:r>
-    </w:p>
-    <w:p>
-      <w:pPr>
-        <w:pStyle w:val="ListBullet"/>
-      </w:pPr>
-      <w:r>
-        <w:t>Supported Phase I/II clinical bioanalytical work in a GLP environment, including assay optimization/validation, QC, sample testing, data analysis, and results/documentation transfer to CRO data teams.</w:t>
-      </w:r>
-    </w:p>
-    <w:p>
-      <w:pPr>
-        <w:pStyle w:val="ListBullet"/>
-      </w:pPr>
-      <w:r>
-        <w:t>Worked with 4,000+ clinical samples and temporarily supported a Phase I sample workflow through receipt/source-document and identity verification, CRO/internal ID traceability, Benchling records, exception investigation, and coordination with the sample manager.</w:t>
-      </w:r>
-    </w:p>
-    <w:p>
-      <w:pPr>
-        <w:pStyle w:val="ListBullet"/>
-      </w:pPr>
-      <w:r>
-        <w:t>Investigated a CRO data discrepancy by reviewing assay data and documentation, clarifying methodology, confirming visit-timing interpretation with internal clinical colleagues, and reviewing corrected CRO output.</w:t>
-      </w:r>
-    </w:p>
-    <w:p>
-      <w:pPr>
-        <w:pStyle w:val="ListBullet"/>
-      </w:pPr>
-      <w:r>
-        <w:t>Coordinated assigned technical/data issues across CRO data teams, internal clinical colleagues, sample-management personnel, and supervisors to support documentation accuracy and issue resolution.</w:t>
-      </w:r>
-    </w:p>
-    <w:p>
-      <w:pPr>
-        <w:pStyle w:val="Heading1"/>
-      </w:pPr>
-      <w:r>
-        <w:t>Independent Projects</w:t>
-      </w:r>
-    </w:p>
-    <w:p>
-      <w:pPr>
-        <w:pStyle w:val="ListBullet"/>
-      </w:pPr>
-      <w:r>
-        <w:rPr>
-          <w:b/>
-        </w:rPr>
-        <w:t>Clinical Study Operations Simulation (independent):</w:t>
-      </w:r>
-      <w:r>
-        <w:t xml:space="preserve"> Built a simulated Phase I timeline and milestone tracker covering dependencies, status/forecast variance, delivery health, and issue escalation/governance workflows.</w:t>
+    </w:p>
+    <w:p>
+      <w:pPr>
+        <w:pStyle w:val="ListBullet"/>
+      </w:pPr>
+      <w:r>
+        <w:rPr>
+          <w:b/>
+        </w:rPr>
+        <w:t>Clinical Study Operations Simulation (Independent):</w:t>
+      </w:r>
+      <w:r>
+        <w:t xml:space="preserve"> Planned a simulated Phase I study timeline and milestone tracker, mapping dependencies, status/forecast variance, and issue escalation workflows.</w:t>
+      </w:r>
+    </w:p>
+    <w:p>
+      <w:pPr>
+        <w:pStyle w:val="ListBullet"/>
+      </w:pPr>
+      <w:r>
+        <w:rPr>
+          <w:b/>
+        </w:rPr>
+        <w:t>Clinical Trial REDCap Simulation (Independent):</w:t>
+      </w:r>
+      <w:r>
+        <w:t xml:space="preserve"> Designed a mock Phase I EDC with longitudinal CRFs and visit/event mapping, including clinical-sample traceability and data-quality controls.</w:t>
       </w:r>
     </w:p>
     <w:p>

</xml_diff>